<commit_message>
toc: copia di lavoro senza sola lettura consigliata; IT v9: numeri di pagina dell'indice ricalcolati
Co-Authored-By: Claude Opus 5.5 (1M context) <noreply@anthropic.com>
Claude-Session: https://claude.ai/code/session_01NcREJmgBnDC4YisvUh8ifp
</commit_message>
<xml_diff>
--- a/T&C/General T&C/Vers 9 - Multilanguage - Q4 2026/9_Termini_e_Condizioni_Generali_Fleequid_F0009_2026_IT.docx
+++ b/T&C/General T&C/Vers 9 - Multilanguage - Q4 2026/9_Termini_e_Condizioni_Generali_Fleequid_F0009_2026_IT.docx
@@ -925,7 +925,7 @@
                 <w:noProof/>
                 <w:webHidden/>
               </w:rPr>
-              <w:t>26</w:t>
+              <w:t>27</w:t>
             </w:r>
             <w:r>
               <w:rPr>
@@ -1022,7 +1022,7 @@
                 <w:noProof/>
                 <w:webHidden/>
               </w:rPr>
-              <w:t>35</w:t>
+              <w:t>36</w:t>
             </w:r>
             <w:r>
               <w:rPr>
@@ -1119,7 +1119,7 @@
                 <w:noProof/>
                 <w:webHidden/>
               </w:rPr>
-              <w:t>38</w:t>
+              <w:t>39</w:t>
             </w:r>
             <w:r>
               <w:rPr>
@@ -1216,7 +1216,7 @@
                 <w:noProof/>
                 <w:webHidden/>
               </w:rPr>
-              <w:t>41</w:t>
+              <w:t>42</w:t>
             </w:r>
             <w:r>
               <w:rPr>
@@ -1313,7 +1313,7 @@
                 <w:noProof/>
                 <w:webHidden/>
               </w:rPr>
-              <w:t>44</w:t>
+              <w:t>45</w:t>
             </w:r>
             <w:r>
               <w:rPr>
@@ -1507,7 +1507,7 @@
                 <w:noProof/>
                 <w:webHidden/>
               </w:rPr>
-              <w:t>53</w:t>
+              <w:t>54</w:t>
             </w:r>
             <w:r>
               <w:rPr>
@@ -1895,7 +1895,7 @@
                 <w:noProof/>
                 <w:webHidden/>
               </w:rPr>
-              <w:t>79</w:t>
+              <w:t>80</w:t>
             </w:r>
             <w:r>
               <w:rPr>
@@ -2282,7 +2282,7 @@
                 <w:noProof/>
                 <w:webHidden/>
               </w:rPr>
-              <w:t>91</w:t>
+              <w:t>92</w:t>
             </w:r>
             <w:r>
               <w:rPr>
@@ -2476,7 +2476,7 @@
                 <w:noProof/>
                 <w:webHidden/>
               </w:rPr>
-              <w:t>93</w:t>
+              <w:t>94</w:t>
             </w:r>
             <w:r>
               <w:rPr>

</xml_diff>

<commit_message>
General T&C v9: correzioni dello studio del 9/10 (redline DEF_DEF) riportate sull'IT pulita, 35 paragrafi; istruzioni per le lingue
Co-Authored-By: Claude Opus 5.5 (1M context) <noreply@anthropic.com>
</commit_message>
<xml_diff>
--- a/T&C/General T&C/Vers 9 - Multilanguage - Q4 2026/9_Termini_e_Condizioni_Generali_Fleequid_F0009_2026_IT.docx
+++ b/T&C/General T&C/Vers 9 - Multilanguage - Q4 2026/9_Termini_e_Condizioni_Generali_Fleequid_F0009_2026_IT.docx
@@ -1363,7 +1363,7 @@
                 <w:smallCaps/>
                 <w:noProof/>
               </w:rPr>
-              <w:t>Vendita differita: pagamento anticipato e Veicolo temporaneamente in uso presso il Venditore.</w:t>
+              <w:t>Vendita differita: Pagamento anticipato e Veicolo temporaneamente in uso presso il Venditore.</w:t>
             </w:r>
             <w:r>
               <w:rPr>
@@ -4346,39 +4346,39 @@
           <w:sz w:val="20"/>
           <w:szCs w:val="20"/>
         </w:rPr>
-        <w:t xml:space="preserve">Il termine può inoltre riferirsi ad altre entità giuridiche, affiliate o designate da Adorea S.r.l. per la </w:t>
-      </w:r>
-      <w:r>
-        <w:rPr>
-          <w:rFonts w:ascii="Verdana" w:eastAsia="Calibri" w:hAnsi="Verdana" w:cs="Arial"/>
-          <w:sz w:val="20"/>
-          <w:szCs w:val="20"/>
-        </w:rPr>
-        <w:t>commercializzazione</w:t>
-      </w:r>
-      <w:r>
-        <w:rPr>
-          <w:rFonts w:ascii="Verdana" w:eastAsia="Calibri" w:hAnsi="Verdana" w:cs="Arial"/>
-          <w:sz w:val="20"/>
-          <w:szCs w:val="20"/>
-        </w:rPr>
-        <w:t xml:space="preserve"> </w:t>
-      </w:r>
-      <w:r>
-        <w:rPr>
-          <w:rFonts w:ascii="Verdana" w:eastAsia="Calibri" w:hAnsi="Verdana" w:cs="Arial"/>
-          <w:sz w:val="20"/>
-          <w:szCs w:val="20"/>
-        </w:rPr>
-        <w:t>di Veicoli</w:t>
-      </w:r>
-      <w:r>
-        <w:rPr>
-          <w:rFonts w:ascii="Verdana" w:eastAsia="Calibri" w:hAnsi="Verdana" w:cs="Arial"/>
-          <w:sz w:val="20"/>
-          <w:szCs w:val="20"/>
-        </w:rPr>
-        <w:t>, secondo quanto previsto dall’art. 2.9</w:t>
+        <w:t xml:space="preserve">Il termine può inoltre riferirsi ad altre entità giuridiche, affiliate o designate da Adorea S.r.l. per la compravendita di Veicoli, secondo</w:t>
+      </w:r>
+      <w:r>
+        <w:rPr>
+          <w:rFonts w:ascii="Verdana" w:eastAsia="Calibri" w:hAnsi="Verdana" w:cs="Arial"/>
+          <w:sz w:val="20"/>
+          <w:szCs w:val="20"/>
+        </w:rPr>
+        <w:t/>
+      </w:r>
+      <w:r>
+        <w:rPr>
+          <w:rFonts w:ascii="Verdana" w:eastAsia="Calibri" w:hAnsi="Verdana" w:cs="Arial"/>
+          <w:sz w:val="20"/>
+          <w:szCs w:val="20"/>
+        </w:rPr>
+        <w:t xml:space="preserve"/>
+      </w:r>
+      <w:r>
+        <w:rPr>
+          <w:rFonts w:ascii="Verdana" w:eastAsia="Calibri" w:hAnsi="Verdana" w:cs="Arial"/>
+          <w:sz w:val="20"/>
+          <w:szCs w:val="20"/>
+        </w:rPr>
+        <w:t/>
+      </w:r>
+      <w:r>
+        <w:rPr>
+          <w:rFonts w:ascii="Verdana" w:eastAsia="Calibri" w:hAnsi="Verdana" w:cs="Arial"/>
+          <w:sz w:val="20"/>
+          <w:szCs w:val="20"/>
+        </w:rPr>
+        <w:t xml:space="preserve"> quanto previsto dall’art. 2.9</w:t>
       </w:r>
       <w:r>
         <w:rPr>
@@ -7717,18 +7717,18 @@
           <w:sz w:val="20"/>
           <w:szCs w:val="20"/>
         </w:rPr>
-        <w:t>termine è sempre riferito al Venditore sostanziale, soggetto diverso rispetto a Fleequid</w:t>
-      </w:r>
-      <w:r>
-        <w:t xml:space="preserve"> </w:t>
-      </w:r>
-      <w:r>
-        <w:rPr>
-          <w:rFonts w:ascii="Verdana" w:eastAsia="Calibri" w:hAnsi="Verdana" w:cs="Arial"/>
-          <w:sz w:val="20"/>
-          <w:szCs w:val="20"/>
-        </w:rPr>
-        <w:t xml:space="preserve">nella Vendita in commissione eseguita mediante Rivendita, ove Fleequid assuma il ruolo di venditore formale, essa è sempre indicata come Fleequid. Nel Dealer Sales il Venditore è il soggetto dal quale Fleequid acquista il Veicolo; </w:t>
+        <w:t>termine è sempre riferito al Venditore sostanziale, soggetto diverso rispetto a Fleequid; nella Vendita</w:t>
+      </w:r>
+      <w:r>
+        <w:t xml:space="preserve"/>
+      </w:r>
+      <w:r>
+        <w:rPr>
+          <w:rFonts w:ascii="Verdana" w:eastAsia="Calibri" w:hAnsi="Verdana" w:cs="Arial"/>
+          <w:sz w:val="20"/>
+          <w:szCs w:val="20"/>
+        </w:rPr>
+        <w:t xml:space="preserve"> in commissione eseguita mediante Rivendita, ove Fleequid assuma il ruolo di venditore formale, essa è sempre indicata come Fleequid. Nel Dealer Sales il Venditore è il soggetto dal quale Fleequid acquista il Veicolo; </w:t>
       </w:r>
       <w:r>
         <w:rPr>
@@ -7765,7 +7765,7 @@
           <w:sz w:val="20"/>
           <w:szCs w:val="20"/>
         </w:rPr>
-        <w:t>Ogni riferimento contenuto nelle presenti CG a</w:t>
+        <w:t>Salvo che la singola disposizione preveda espressamente un termine in giorni di calendario, ogni riferimento contenuto nelle presenti CG a</w:t>
       </w:r>
       <w:r>
         <w:rPr>
@@ -8860,15 +8860,15 @@
           <w:sz w:val="20"/>
           <w:szCs w:val="20"/>
         </w:rPr>
-        <w:t>Nell'ambito della Vendita in commissione, Fleequid può, a propria insindacabile discrezione, decidere di non operare la Rivendita e di dare esecuzione alla compravendita commissionata quale Intermediario puro, consentendo che il trasferimento del Veicolo e la relativa fatturazione avvengano direttamente dal Venditore all'Acquirente. In tale caso la compravendita del Veicolo è conclusa direttamente tra il Venditore e l'Acquirente; Fleequid non la conclude, né in nome proprio né quale parte, non acquista il Veicolo, neppure temporaneamente, non assume la qualità di venditore, neppure formale, e il prezzo del Veicolo è corrisposto dall'Acquirente direttamente al Venditore; Fleequid conserva il diritto alle Commissioni dovute da entrambe le Parti e alle Tariffe secondo quanto previsto dalle presenti Condizioni Generali. L'operatività quale Intermediario puro costituisce modalità interna di esecuzione della Vendita in commissione ai sensi dell'art. 2.3 e non un autonomo Modello di Vendita. La facoltà di scelta prevista dal presente comma è esercitata secondo quanto previsto dagli artt. 3.2, 3.5 e 17.1 ed è preventivamente resa conoscibile e accettata ai sensi dell'art. 3.2, lett. a)</w:t>
-      </w:r>
-      <w:r>
-        <w:rPr>
-          <w:rFonts w:ascii="Verdana" w:hAnsi="Verdana"/>
-          <w:sz w:val="20"/>
-          <w:szCs w:val="20"/>
-        </w:rPr>
-        <w:t>.</w:t>
+        <w:t>Nell'ambito della Vendita in commissione, Fleequid può, a propria insindacabile discrezione, decidere di non operare la Rivendita e di dare esecuzione alla compravendita commissionata quale Intermediario puro, consentendo che il trasferimento del Veicolo e la relativa fatturazione avvengano direttamente dal Venditore all'Acquirente. In tale caso la compravendita del Veicolo è conclusa direttamente tra il Venditore e l'Acquirente; Fleequid non la conclude, né in nome proprio né quale parte, non acquista il Veicolo, neppure temporaneamente, non assume la qualità di venditore, neppure formale, e il prezzo del Veicolo è corrisposto dall'Acquirente direttamente al Venditore; Fleequid conserva il diritto alle Commissioni dovute da entrambe le Parti e alle Tariffe secondo quanto previsto dalle presenti Condizioni Generali. L'operatività quale Intermediario puro costituisce modalità interna di esecuzione della Vendita in commissione ai sensi dell'art. 2.3 e non un autonomo Modello di Vendita. La facoltà di scelta prevista dal presente comma è esercitata secondo quanto previsto dagli artt. 3.2, 3.5 e 17.1, è preventivamente resa conoscibile ai sensi dell'art. 3.2, lett. a) e accettata mediante l’adesione alle presenti CG.</w:t>
+      </w:r>
+      <w:r>
+        <w:rPr>
+          <w:rFonts w:ascii="Verdana" w:hAnsi="Verdana"/>
+          <w:sz w:val="20"/>
+          <w:szCs w:val="20"/>
+        </w:rPr>
+        <w:t/>
       </w:r>
     </w:p>
     <w:p>
@@ -9829,7 +9829,7 @@
           <w:sz w:val="20"/>
           <w:szCs w:val="20"/>
         </w:rPr>
-        <w:t xml:space="preserve">adeguare le modalità operative del Marketplace ovvero per conformarsi a disposizioni di legge, regolamentari o a provvedimenti delle autorità competenti. Le modifiche sono comunicate agli Utenti in modo chiaro e comprensibile con un preavviso di almeno 30 (trenta) giorni rispetto alla loro entrata in vigore, salvo che l'Utente le abbia espressamente accettate prima della scadenza di tale termine. Fleequid conserva un archivio delle versioni precedenti delle Condizioni Generali e del Tariffario Fleequid, accessibile contattando il supporto clienti. Le modifiche possono essere comunicate con uno o più dei seguenti strumenti: a) e-mail all'indirizzo di posta elettronica associato al profilo dell'Utente, contenente un riassunto delle </w:t>
+        <w:t xml:space="preserve">adeguare le modalità operative del Marketplace ovvero per conformarsi a disposizioni di legge, regolamentari o a provvedimenti delle autorità competenti. Le modifiche sono comunicate agli Utenti in modo chiaro e comprensibile con un preavviso di almeno 30 (trenta) giorni di calendario rispetto alla loro entrata in vigore, salvo che l'Utente le abbia espressamente accettate prima della scadenza di tale termine. Fleequid conserva un archivio delle versioni precedenti delle Condizioni Generali e del Tariffario Fleequid, accessibile contattando il supporto clienti. Le modifiche possono essere comunicate con uno o più dei seguenti strumenti: a) e-mail all'indirizzo di posta elettronica associato al profilo dell'Utente, contenente un riassunto delle </w:t>
       </w:r>
       <w:r>
         <w:rPr>
@@ -9838,7 +9838,7 @@
           <w:szCs w:val="20"/>
         </w:rPr>
         <w:lastRenderedPageBreak/>
-        <w:t xml:space="preserve">modifiche e un link ai testi aggiornati; b) notifica visualizzata alla successiva autenticazione dell'Utente sul Marketplace; c) pubblicazione di un annuncio sulla homepage del sito web di Fleequid, con link ai testi aggiornati. L'Utente che non intenda accettare le modifiche può recedere senza incorrere in penalità entro 30 (trenta) giorni dalla comunicazione e comunque dalla pubblicazione delle Condizioni Generali aggiornate sul Marketplace, mediante comunicazione scritta all'indirizzo e-mail </w:t>
+        <w:t xml:space="preserve">modifiche e un link ai testi aggiornati; b) notifica visualizzata alla successiva autenticazione dell'Utente sul Marketplace; c) pubblicazione di un annuncio sulla homepage del sito web di Fleequid, con link ai testi aggiornati. L'Utente che non intenda accettare le modifiche può recedere senza incorrere in penalità entro 30 (trenta) giorni di calendario dalla comunicazione e comunque dalla pubblicazione delle Condizioni Generali aggiornate sul Marketplace, mediante comunicazione scritta all'indirizzo e-mail </w:t>
       </w:r>
       <w:r>
         <w:t>withdrawal@fleequid.co</w:t>
@@ -11443,7 +11443,7 @@
           <w:sz w:val="20"/>
           <w:szCs w:val="20"/>
         </w:rPr>
-        <w:t>ai sensi del precedente art. 5.5, indicandone le relative motivazioni. In relazione alla natura e alla gravità delle circostanze riscontrate, Fleequid può adottare immediatamente le misure necessarie a far cessare o contenere la situazione contestata ovvero invitare l'Utente a porvi rimedio entro il termine di 30 (trenta) giorni. Decorso inutilmente tale termine, Fleequid può sospendere o bloccare, anche a tempo indeterminato, il profilo dell'Utente o limitarne l'accesso al Marketplace e ai relativi Servizi. Il predetto termine non trova applicazione quando: a) Fleequid debba adempiere a un obbligo di legge, regolamentare o a un provvedimento dell'autorità competente che richieda l'immediata cessazione o limitazione della fornitura di Veicoli o Servizi all'Utente; b) ricorrano i presupposti per l'immediata risoluzione del Contratto secondo la legge o le presenti Condizioni Generali; c) l'Utente abbia ripetutamente violato le regole di utilizzo del Marketplace; d) i dati o i contenuti riconducibili all'Utente siano illeciti o inappropriati, ovvero la sua condotta possa compromettere la sicurezza o il corretto funzionamento del Marketplace, di Fleequid o degli altri Utenti; e) la condotta sia connessa a frodi, contraffazioni, violazioni in materia di dati personali, spam o altre attività illecite o abusive. In tali casi Fleequid può adottare il provvedimento senza preventiva diffida, fornendone comunque all'Utente la relativa motivazione. La Classificazione dell'Utente di cui all'art. 6 non costituisce un provvedimento ai sensi del presente comma e non è soggetta alla procedura qui prevista. Parimenti, la limitazione o sospensione dell'operatività dell'account disposta nei confronti dell'Acquirente in ritardo o inadempiente ai sensi dell'art. 12.10 costituisce misura autonoma, disciplinata da tale disposizione, non è assorbita nel procedimento previsto dal presente comma e non è subordinata ai relativi presupposti e termini</w:t>
+        <w:t>ai sensi del precedente art. 5.5, indicandone le relative motivazioni. In relazione alla natura e alla gravità delle circostanze riscontrate, Fleequid può adottare immediatamente le misure necessarie a far cessare o contenere la situazione contestata ovvero invitare l'Utente a porvi rimedio entro il termine di 30 (trenta) giorni. Decorso inutilmente tale termine, Fleequid può sospendere o bloccare, anche a tempo indeterminato, il profilo dell'Utente o limitarne l'accesso al Marketplace e ai relativi Servizi. Il predetto termine non trova applicazione quando: a) Fleequid debba adempiere a un obbligo di legge, regolamentare o a un provvedimento dell'autorità competente che richieda l'immediata cessazione o limitazione della fornitura di Veicoli o Servizi all'Utente; b) ricorrano i presupposti per l'immediata risoluzione del Contratto secondo la legge o le presenti Condizioni Generali; c) l'Utente abbia ripetutamente violato le regole di utilizzo del Marketplace; d) i dati o i contenuti riconducibili all'Utente siano illeciti o inappropriati, ovvero la sua condotta possa compromettere la sicurezza o il corretto funzionamento del Marketplace, di Fleequid o degli altri Utenti; e) la condotta sia connessa a frodi, contraffazioni, violazioni in materia di dati personali, spam o altre attività illecite o abusive. In tali casi Fleequid può adottare il provvedimento senza preventiva diffida, fornendone comunque all'Utente la relativa motivazione. La Classificazione dell'Utente di cui all'art. 6 non costituisce un provvedimento ai sensi del presente comma e non è soggetta alla procedura qui prevista. Parimenti, la limitazione o sospensione dell'operatività del profilo disposta nei confronti dell'Acquirente in ritardo o inadempiente ai sensi dell'art. 12.10 costituisce misura autonoma, disciplinata da tale disposizione, non è assorbita nel procedimento previsto dal presente comma e non è subordinata ai relativi presupposti e termini</w:t>
       </w:r>
       <w:r>
         <w:rPr>
@@ -11715,15 +11715,15 @@
           <w:sz w:val="20"/>
           <w:szCs w:val="20"/>
         </w:rPr>
-        <w:t>ogni controversia relativa all'applicazione di quanto disciplinato dal presente articolo è devoluta a un tentativo di mediazione della Camera di Mediazione attiva presso la Camera di Commercio di Como, con cui Fleequid dichiara di voler collaborare, ai fini di un tentativo di mediazione gestito con un mediatore persona fisica designato e operante secondo le disposizioni del regolamento di mediazione di tale Camera di Commercio, che l'Utente può consultare nell'apposita sezione del relativo sito istituzionale. Resta ferma la disciplina della procedura di reclamo relativa ai Veicoli di cui all'art. 20</w:t>
-      </w:r>
-      <w:r>
-        <w:rPr>
-          <w:rFonts w:ascii="Verdana" w:hAnsi="Verdana"/>
-          <w:sz w:val="20"/>
-          <w:szCs w:val="20"/>
-        </w:rPr>
-        <w:t>.</w:t>
+        <w:t>le controversie relative all’accesso al Marketplace, al suo utilizzo e alle misure di limitazione, sospensione o cessazione dell’accesso o dell’operatività dell’Utente adottate da Fleequid ai sensi del presente articolo sono devolute a un tentativo di mediazione della Camera di Mediazione attiva presso la Camera di Commercio di Como, con cui Fleequid dichiara di voler collaborare, ai fini di un tentativo di mediazione gestito con un mediatore persona fisica designato e operante secondo le disposizioni del regolamento di mediazione di tale Camera di Commercio, che l'Utente può consultare nell'apposita sezione del relativo sito istituzionale. Resta ferma e autonoma la disciplina della procedura di reclamo relativa ai Veicoli di cui all'art. 20, alla quale non si applica il tentativo di mediazione di cui al presente comma salvo che la controversia riguardi anche, autonomamente, una delle materie indicate nel periodo precedente.</w:t>
+      </w:r>
+      <w:r>
+        <w:rPr>
+          <w:rFonts w:ascii="Verdana" w:hAnsi="Verdana"/>
+          <w:sz w:val="20"/>
+          <w:szCs w:val="20"/>
+        </w:rPr>
+        <w:t/>
       </w:r>
     </w:p>
     <w:p>
@@ -12119,7 +12119,7 @@
           <w:szCs w:val="20"/>
         </w:rPr>
         <w:lastRenderedPageBreak/>
-        <w:t>conoscibilità dell'obbligo di versamento e del relativo importo, che prevale in ogni caso sui valori ordinariamente applicati</w:t>
+        <w:t>conoscibilità dell'obbligo di versamento e del relativo importo; l’obbligo e l’importo concretamente resi conoscibili all’Offerente ai sensi dell’art. 6.1 prevalgono in ogni caso sui valori ordinariamente applicati</w:t>
       </w:r>
       <w:r>
         <w:rPr>
@@ -12363,31 +12363,7 @@
           <w:sz w:val="20"/>
           <w:szCs w:val="20"/>
         </w:rPr>
-        <w:t xml:space="preserve">Al momento della registrazione sul Marketplace di Fleequid, l’Utente registrato </w:t>
-      </w:r>
-      <w:r>
-        <w:rPr>
-          <w:rFonts w:ascii="Verdana" w:hAnsi="Verdana"/>
-          <w:sz w:val="20"/>
-          <w:szCs w:val="20"/>
-        </w:rPr>
-        <w:t xml:space="preserve">dichiara di aver preso visione dell’Informativa Privacy </w:t>
-      </w:r>
-      <w:r>
-        <w:rPr>
-          <w:rFonts w:ascii="Verdana" w:hAnsi="Verdana"/>
-          <w:sz w:val="20"/>
-          <w:szCs w:val="20"/>
-        </w:rPr>
-        <w:t xml:space="preserve">in conformità alle leggi vigenti e a quanto richiesto dall’art. 13 GDPR -Regolamento (UE) 2016/679 raggiungibile al seguente </w:t>
-      </w:r>
-      <w:r>
-        <w:rPr>
-          <w:rFonts w:ascii="Verdana" w:hAnsi="Verdana"/>
-          <w:sz w:val="20"/>
-          <w:szCs w:val="20"/>
-        </w:rPr>
-        <w:t xml:space="preserve">indirizzo: </w:t>
+        <w:t xml:space="preserve">Al momento della registrazione sul Marketplace di Fleequid, l’Utente registrato dichiara di aver preso visione dell’Informativa Privacy, raggiungibile al seguente indirizzo: </w:t>
       </w:r>
       <w:hyperlink r:id="rId16" w:history="1">
         <w:r>
@@ -12400,63 +12376,7 @@
           <w:sz w:val="20"/>
           <w:szCs w:val="20"/>
         </w:rPr>
-        <w:t>.</w:t>
-      </w:r>
-      <w:r>
-        <w:rPr>
-          <w:rFonts w:ascii="Verdana" w:hAnsi="Verdana"/>
-          <w:sz w:val="20"/>
-          <w:szCs w:val="20"/>
-        </w:rPr>
-        <w:t xml:space="preserve"> Il trattamento dei dati personali avviene con l’osservanza di ogni misura cautela</w:t>
-      </w:r>
-      <w:r>
-        <w:rPr>
-          <w:rFonts w:ascii="Verdana" w:hAnsi="Verdana"/>
-          <w:sz w:val="20"/>
-          <w:szCs w:val="20"/>
-        </w:rPr>
-        <w:t>ti</w:t>
-      </w:r>
-      <w:r>
-        <w:rPr>
-          <w:rFonts w:ascii="Verdana" w:hAnsi="Verdana"/>
-          <w:sz w:val="20"/>
-          <w:szCs w:val="20"/>
-        </w:rPr>
-        <w:t>va, che ne garan</w:t>
-      </w:r>
-      <w:r>
-        <w:rPr>
-          <w:rFonts w:ascii="Verdana" w:hAnsi="Verdana"/>
-          <w:sz w:val="20"/>
-          <w:szCs w:val="20"/>
-        </w:rPr>
-        <w:t>ti</w:t>
-      </w:r>
-      <w:r>
-        <w:rPr>
-          <w:rFonts w:ascii="Verdana" w:hAnsi="Verdana"/>
-          <w:sz w:val="20"/>
-          <w:szCs w:val="20"/>
-        </w:rPr>
-        <w:t xml:space="preserve">sce la sicurezza e la riservatezza, in </w:t>
-      </w:r>
-      <w:r>
-        <w:rPr>
-          <w:rFonts w:ascii="Verdana" w:hAnsi="Verdana"/>
-          <w:sz w:val="20"/>
-          <w:szCs w:val="20"/>
-        </w:rPr>
-        <w:t xml:space="preserve">conformità </w:t>
-      </w:r>
-      <w:r>
-        <w:rPr>
-          <w:rFonts w:ascii="Verdana" w:hAnsi="Verdana"/>
-          <w:sz w:val="20"/>
-          <w:szCs w:val="20"/>
-        </w:rPr>
-        <w:t>a quanto previsto dal GDPR agli scopi e per le finalità indicate in tale Informativa Privacy, che indica e chiarisce anche i diritti e le procedure attivabili dall’interessato del trattamento in relazione ai propri dati personali.</w:t>
+        <w:t>, in conformità alle leggi vigenti e a quanto richiesto dall’art. 13 GDPR - Regolamento (UE) 2016/679. Il trattamento dei dati personali avviene con l’osservanza di ogni misura cautelativa, che ne garantisce la sicurezza e la riservatezza, in conformità a quanto previsto dal GDPR agli scopi e per le finalità indicate in tale Informativa Privacy, che indica e chiarisce anche i diritti e le procedure attivabili dall’interessato del trattamento in relazione ai propri dati personali.</w:t>
       </w:r>
     </w:p>
     <w:p>
@@ -13872,7 +13792,7 @@
           <w:sz w:val="20"/>
           <w:szCs w:val="20"/>
         </w:rPr>
-        <w:t>Una volta cessato l'impegno di commercializzazione assunto ai sensi dell'art. 8.8, qualora il Veicolo non sia stato venduto, il Venditore può provvedere autonomamente alla sua vendita attraverso qualsiasi altro canale, senza vincoli di prezzo minimo e nei confronti di qualsiasi soggetto, fermi restando gli obblighi di trasferimento del Veicolo eventualmente già sorti o ancora pendenti in relazione a una specifica operazione e, in particolare, nell'ambito del Dealer Sales. Resta fermo l'obbligo del Venditore di non utilizzare informazioni, contatti o opportunità commerciali acquisiti tramite il Marketplace o per il tramite di Fleequid allo scopo di concludere, direttamente o indirettamente, operazioni volte ad aggirare l'intervento di Fleequid. Tale obbligo permane per 24 (ventiquattro) mesi dalla prima pubblicazione dell'Inserzione relativa al Veicolo sul Marketplace ovvero, qualora non sia prevista la pubblicazione di un'Inserzione, dalla prima attività di commercializzazione del Veicolo effettuata da Fleequid. In caso di violazione, Fleequid ha diritto di applicare al Venditore la penale determinata secondo il criterio previsto dall'art. 8.9. Qualora il Venditore, quando sia tenuto al trasferimento del Veicolo secondo il Modello di Vendita applicabile e le presenti Condizioni Generali, rifiuti senza giustificato motivo di trasferirne la proprietà: a) a Fleequid, nell'ambito della Vendita in commissione eseguita mediante Rivendita, il Venditore è tenuto a corrispondere una penale pari al 30% del Prezzo di vendita all'Acquirente; b) a Fleequid, nell'ambito del Dealer Sales, il Venditore è tenuto a corrispondere una penale pari al 30% del Prezzo di acquisto dovuto da Fleequid al Venditore; c) direttamente all'Acquirente, nei casi in cui Fleequid operi quale Intermediario puro ai sensi dell'art. 2.6, il Venditore è tenuto a corrispondere a Fleequid una penale pari al 30% del Prezzo di vendita all'Acquirente.</w:t>
+        <w:t>Una volta cessato l'impegno di commercializzazione assunto ai sensi dell'art. 8.8, qualora il Veicolo non sia stato venduto, il Venditore può provvedere autonomamente alla sua vendita attraverso qualsiasi altro canale, senza vincoli di prezzo minimo e nei confronti di qualsiasi soggetto, fermi restando gli obblighi di trasferimento del Veicolo eventualmente già sorti o ancora pendenti in relazione a una specifica operazione e, in particolare, nell'ambito del Dealer Sales. Resta fermo l'obbligo del Venditore di non utilizzare informazioni, contatti o opportunità commerciali acquisiti tramite il Marketplace o per il tramite di Fleequid allo scopo di concludere, direttamente o indirettamente, operazioni volte ad aggirare l'intervento di Fleequid. Tale obbligo permane per 24 (ventiquattro) mesi dalla prima pubblicazione dell'Inserzione relativa al Veicolo sul Marketplace ovvero, qualora non sia prevista la pubblicazione di un'Inserzione, dalla prima attività di commercializzazione del Veicolo effettuata da Fleequid. In caso di violazione, Fleequid ha diritto di applicare al Venditore la penale determinata secondo il criterio previsto dall'art. 8.9. Qualora il Venditore, quando sia tenuto al trasferimento del Veicolo secondo il Modello di Vendita applicabile e le presenti Condizioni Generali, rifiuti senza giustificato motivo di trasferirne la proprietà: a) a Fleequid, nell'ambito della Vendita in commissione eseguita mediante Rivendita, il Venditore è tenuto a corrispondere alla stessa una penale pari al 30% del Prezzo di vendita all'Acquirente; b) a Fleequid, nell'ambito del Dealer Sales, il Venditore è tenuto a corrispondere alla stessa una penale pari al 30% del Prezzo di acquisto dovuto da Fleequid al Venditore; c) direttamente all'Acquirente, nei casi in cui Fleequid operi quale Intermediario puro ai sensi dell'art. 2.6, il Venditore è tenuto a corrispondere a Fleequid una penale pari al 30% del Prezzo di vendita all'Acquirente.</w:t>
       </w:r>
       <w:r>
         <w:t xml:space="preserve"> </w:t>
@@ -14143,7 +14063,7 @@
           <w:sz w:val="20"/>
           <w:szCs w:val="20"/>
         </w:rPr>
-        <w:t xml:space="preserve">Il Venditore si impegna a manlevare e tenere indenne Fleequid, le società da essa controllate, collegate o affiliate, nonché i relativi amministratori, soci, dipendenti, collaboratori, agenti e rappresentanti, da qualsiasi rivendicazione, pretesa, causa, azione, controversia, danno, costo, spesa od onere di qualunque natura derivante da: a) falsità, omissioni, inesattezze o violazioni relative alle dichiarazioni, alle garanzie e agli impegni assunti dal Venditore ai sensi delle presenti Condizioni Generali, ivi comprese, a titolo esemplificativo e non esaustivo, le omissioni o inesattezze nelle Specifiche tecniche o nelle informazioni relative allo stato, alle caratteristiche e al funzionamento del Veicolo, quali la presenza di ruggine non dichiarata, il malfunzionamento dell'impianto di aria condizionata, la mancanza di parti o accessori, la presenza di spie di avaria o di allarme accese e le fattispecie analoghe; b) presenza di materiali pericolosi associati al Veicolo o contaminazioni derivanti da perdite, fuoriuscite, guasti o difetti di funzionamento; c) mancata, incompleta o tardiva produzione della documentazione, anche in originale, necessaria per il trasferimento, l'intestazione, la consegna o la circolazione del Veicolo; d) Gravami sul Veicolo non espressamente dichiarati dal Venditore e accettati nell'ambito della specifica operazione; e) somme corrisposte o costi sostenuti da Fleequid in relazione a spese, privilegi, diritti, vincoli o pretese, registrati o non registrati, fatti valere da creditori, autorità o altri soggetti sul Veicolo o in relazione allo stesso, al fine di consentirne la libera circolazione giuridica o il trasferimento; f) mancato rispetto della normativa applicabile, anche in materia ambientale, ivi compresa ogni responsabilità connessa alla qualificazione, detenzione, gestione, trasporto, recupero o smaltimento di Veicoli destinati alla rottamazione o qualificabili come VFU, nonché all'omessa, incompleta o tardiva comunicazione a Fleequid della relativa destinazione o qualificazione; g) utilizzo improprio o non conforme del Marketplace da parte del Venditore; h) imposte, tasse, costi, spese o altri oneri derivanti dall'inosservanza, da parte del Venditore, di leggi, regolamenti o obblighi a esso applicabili in relazione al Veicolo o all'operazione; i) qualsiasi altra condotta colposa, dolosa o comunque illecita del Venditore in relazione alle presenti Condizioni Generali, ai Contratti o alla specifica operazione. Gli esempi indicati alla lett. a) hanno carattere meramente esemplificativo e non limitano in alcun modo la portata generale della manleva. La presente manleva si estende espressamente, nel Dealer Sales, alle pretese avanzate dall'Acquirente nei confronti di Fleequid nella sua qualità di venditore sostanziale e a tutte le somme, i rimborsi, i costi, le spese di riparazione, gli oneri e i danni che Fleequid sia tenuta a corrispondere o sostenere nei confronti del proprio Acquirente per fatti, vizi, difetti, omissioni o inadempimenti imputabili al Venditore; in tali casi Fleequid ha diritto di regresso nei confronti del Venditore e al rimborso integrale di quanto corrisposto o sostenuto. Il Venditore resta </w:t>
+        <w:t xml:space="preserve">Il Venditore si impegna a manlevare e tenere indenne Fleequid, le società da essa controllate, collegate o affiliate, nonché i relativi amministratori, soci, dipendenti, collaboratori, agenti e rappresentanti, da qualsiasi rivendicazione, pretesa, causa, azione, controversia, danno, costo, spesa od onere di qualunque natura derivante da: a) falsità, omissioni, inesattezze o violazioni relative alle dichiarazioni, alle garanzie e agli impegni assunti dal Venditore ai sensi delle presenti Condizioni Generali, ivi comprese, a titolo esemplificativo e non esaustivo, le omissioni o inesattezze nelle Specifiche tecniche o nelle informazioni relative allo stato, alle caratteristiche e al funzionamento del Veicolo, quali la presenza di ruggine non dichiarata, il malfunzionamento dell'impianto di aria condizionata, la mancanza di parti o accessori, la presenza di spie di avaria o di allarme accese e le fattispecie analoghe; b) presenza di materiali pericolosi associati al Veicolo o contaminazioni derivanti da perdite, fuoriuscite, guasti o difetti di funzionamento; c) mancata, incompleta o tardiva produzione della documentazione, anche in originale, necessaria per il trasferimento, l'intestazione, la consegna o la circolazione del Veicolo; d) Gravami sul Veicolo diversi da quelli espressamente dichiarati dal Venditore e accettati nell'ambito della specifica operazione; e) somme corrisposte o costi sostenuti da Fleequid in relazione a spese, privilegi, diritti, vincoli o pretese, registrati o non registrati, fatti valere da creditori, autorità o altri soggetti sul Veicolo o in relazione allo stesso, al fine di consentirne la libera circolazione giuridica o il trasferimento; f) mancato rispetto della normativa applicabile, anche in materia ambientale, ivi compresa ogni responsabilità connessa alla qualificazione, detenzione, gestione, trasporto, recupero o smaltimento di Veicoli destinati alla rottamazione o qualificabili come VFU, nonché all'omessa, incompleta o tardiva comunicazione a Fleequid della relativa destinazione o qualificazione; g) utilizzo improprio o non conforme del Marketplace da parte del Venditore; h) imposte, tasse, costi, spese o altri oneri derivanti dall'inosservanza, da parte del Venditore, di leggi, regolamenti o obblighi a esso applicabili in relazione al Veicolo o all'operazione; i) qualsiasi altra condotta colposa, dolosa o comunque illecita del Venditore in relazione alle presenti Condizioni Generali, ai Contratti o alla specifica operazione. Gli esempi indicati alla lett. a) hanno carattere meramente esemplificativo e non limitano in alcun modo la portata generale della manleva. La presente manleva si estende espressamente, nel Dealer Sales, alle pretese avanzate dall'Acquirente nei confronti di Fleequid nella sua qualità di venditore sostanziale e a tutte le somme, i rimborsi, i costi, le spese di riparazione, gli oneri e i danni che Fleequid sia tenuta a corrispondere o sostenere nei confronti del proprio Acquirente per fatti, vizi, difetti, omissioni o inadempimenti imputabili al Venditore; in tali casi Fleequid ha diritto di regresso nei confronti del Venditore e al rimborso integrale di quanto corrisposto o sostenuto. Il Venditore resta </w:t>
       </w:r>
       <w:r>
         <w:rPr>
@@ -15907,7 +15827,7 @@
           <w:sz w:val="20"/>
           <w:szCs w:val="20"/>
         </w:rPr>
-        <w:t>Salvo quanto previsto dai successivi commi, il Termine di pagamento è di 3 (tre) giorni lavorativi decorrenti dalla messa a disposizione dell'Acquirente della Proforma ai sensi dell'art. 11.4. Il Termine di pagamento decorre esclusivamente da tale momento e a condizione che la Proforma contenga gli elementi necessari per consentire all'Acquirente di eseguire il pagamento. Qualora Fleequid operi quale Intermediario puro, il medesimo Termine si applica tanto al pagamento del prezzo dovuto al Venditore quanto al pagamento delle Commissioni, delle Tariffe e degli eventuali ulteriori importi dovuti a Fleequid.</w:t>
+        <w:t>Salvo quanto previsto dai successivi commi, il Termine di pagamento è di 3 (tre) giorni decorrenti dalla messa a disposizione dell'Acquirente della Proforma ai sensi dell'art. 11.4. Il Termine di pagamento decorre esclusivamente da tale momento e a condizione che la Proforma contenga gli elementi necessari per consentire all'Acquirente di eseguire il pagamento. Qualora Fleequid operi quale Intermediario puro, il medesimo Termine si applica tanto al pagamento del prezzo dovuto al Venditore quanto al pagamento delle Commissioni, delle Tariffe e degli eventuali ulteriori importi dovuti a Fleequid.</w:t>
       </w:r>
     </w:p>
     <w:p>
@@ -16356,7 +16276,7 @@
           <w:sz w:val="20"/>
           <w:szCs w:val="20"/>
         </w:rPr>
-        <w:t>. 12.9, ultimo periodo.</w:t>
+        <w:t>. 12.9.</w:t>
       </w:r>
     </w:p>
     <w:p>
@@ -16602,7 +16522,7 @@
           <w:sz w:val="20"/>
           <w:szCs w:val="20"/>
         </w:rPr>
-        <w:t xml:space="preserve">n caso di Annullamento della vendita per ritardo o mancato integrale pagamento imputabile all'Acquirente restano definitivamente dovuti a Fleequid: a) le Commissioni a carico dell'Acquirente, ove previste per la specifica operazione, secondo quanto stabilito dall'art. 12.4; b) la penale giornaliera di cui all'art. 12.6, lett. a), maturata sino alla data di efficacia dell'Annullamento della vendita, nonché gli interessi moratori maturati; c) nella Vendita in commissione, sia quando Fleequid operi mediante Rivendita sia quando operi quale Intermediario puro, un'ulteriore penale di importo pari a due volte le Commissioni a carico dell'Acquirente, determinata sulla base delle Commissioni applicabili alla specifica operazione, cosicché l'ammontare complessivamente dovuto per Commissioni e per la presente penale sia pari a tre volte l'importo delle Commissioni; d) un'ulteriore penale di € 1.000,00 (euro mille/00) per ciascun Veicolo interessato dall'Accordo vincolante successivamente annullato; e) le Tariffe relative ai Servizi già resi e ogni altro importo maturato per distinto titolo ai sensi delle presenti Condizioni Generali. Nel Dealer Sales, non essendo dovute Commissioni dall'Acquirente secondo la Vendita in commissione, non trova applicazione la penale di cui alla lett. c); restano invece dovuti gli importi di cui alle lett. b), d) ed e). Ove ricorrano i presupposti previsti dall'art. 13, resta altresì ferma </w:t>
+        <w:t xml:space="preserve">n caso di Annullamento della vendita per ritardo o mancato integrale pagamento imputabile all'Acquirente restano definitivamente dovuti a Fleequid: a) le Commissioni a carico dell'Acquirente, ove previste per la specifica operazione, secondo quanto stabilito dall'art. 12.4; b) la penale giornaliera di cui all'art. 12.6, lett. a), maturata sino alla data di efficacia dell'Annullamento della vendita, nonché gli interessi moratori maturati; c) nella Vendita in commissione, sia quando Fleequid operi mediante Rivendita sia quando operi quale Intermediario puro, un'ulteriore penale di importo pari a due volte le Commissioni a carico dell'Acquirente, determinata sulla base delle Commissioni applicabili alla specifica operazione, cosicché l'ammontare complessivamente dovuto per Commissioni e per la presente penale sia pari a tre volte l'importo delle Commissioni; d) un'ulteriore penale di € 1.000,00 (euro mille/00) per ciascun Veicolo interessato dall'Accordo vincolante successivamente annullato; e) le Tariffe relative ai Servizi già resi e ogni altro importo maturato per distinto titolo ai sensi delle presenti Condizioni Generali. Nel Dealer Sales, non essendo dovute dall’Acquirente le Commissioni previste per la Vendita in commissione, non trova applicazione la penale di cui alla lett. c); restano invece dovuti gli importi di cui alle lett. b), d) ed e). Ove ricorrano i presupposti previsti dall'art. 13, resta altresì ferma </w:t>
       </w:r>
       <w:r>
         <w:rPr>
@@ -16787,7 +16707,7 @@
           <w:sz w:val="20"/>
           <w:szCs w:val="20"/>
         </w:rPr>
-        <w:t>Vend</w:t>
+        <w:t>Vendita differita: Pagamento anticipato</w:t>
       </w:r>
       <w:r>
         <w:rPr>
@@ -16798,7 +16718,7 @@
           <w:sz w:val="20"/>
           <w:szCs w:val="20"/>
         </w:rPr>
-        <w:t xml:space="preserve">ita differita: </w:t>
+        <w:t xml:space="preserve"/>
       </w:r>
       <w:bookmarkStart w:id="83" w:name="_Toc240781620"/>
       <w:bookmarkStart w:id="84" w:name="_Toc240781621"/>
@@ -16907,7 +16827,7 @@
           <w:sz w:val="20"/>
           <w:szCs w:val="20"/>
         </w:rPr>
-        <w:t>p</w:t>
+        <w:t/>
       </w:r>
       <w:r>
         <w:rPr>
@@ -16918,7 +16838,7 @@
           <w:sz w:val="20"/>
           <w:szCs w:val="20"/>
         </w:rPr>
-        <w:t>agamento anticipato e Veicolo temporaneamente in uso presso il Venditore.</w:t>
+        <w:t xml:space="preserve"> e Veicolo temporaneamente in uso presso il Venditore.</w:t>
       </w:r>
       <w:bookmarkEnd w:id="82"/>
     </w:p>
@@ -16979,7 +16899,7 @@
           <w:sz w:val="20"/>
           <w:szCs w:val="20"/>
         </w:rPr>
-        <w:t xml:space="preserve"> circostanza che il Veicolo rimanga temporaneamente in uso presso il Venditore, unitamente alle condizioni particolari applicabili all'operazione, deve essere resa conoscibile all'Offerente prima della formulazione dell'Offerta secondo quanto previsto dagli artt. 3.2 e 4.5. Ove richiesto, il Pagamento anticipato deve essere corrisposto entro il Termine di pagamento ordinario di cui all'art. 11.5, decorrente dalla messa a disposizione della Proforma, salvo che le Condizioni particolari di vendita prevedano espressamente un diverso termine ai sensi dell'art. 11.6, lett. b). La presente disciplina si applica esclusivamente a tale fattispecie e costituisce deroga alla disciplina ordinaria del Termine di pagamento nei limiti previsti dal presente articolo e dalle Condizioni particolari di vendita applicabili.</w:t>
+        <w:t xml:space="preserve"> circostanza che il Veicolo rimanga temporaneamente in uso presso il Venditore, unitamente alle Condizioni particolari di vendita applicabili all'operazione, deve essere resa conoscibile all'Offerente prima della formulazione dell'Offerta secondo quanto previsto dagli artt. 3.2 e 4.5. Ove richiesto, il Pagamento anticipato deve essere corrisposto entro il Termine di pagamento ordinario di cui all'art. 11.5, decorrente dalla messa a disposizione della Proforma, salvo che le Condizioni particolari di vendita prevedano espressamente un diverso termine ai sensi dell'art. 11.6, lett. b). La presente disciplina si applica esclusivamente a tale fattispecie e costituisce deroga alla disciplina ordinaria del Termine di pagamento nei limiti previsti dal presente articolo e dalle Condizioni particolari di vendita applicabili.</w:t>
       </w:r>
     </w:p>
     <w:p>
@@ -17088,7 +17008,7 @@
           <w:sz w:val="20"/>
           <w:szCs w:val="20"/>
         </w:rPr>
-        <w:t>Il mancato pagamento del Pagamento anticipato entro il relativo termine ovvero il mancato pagamento integrale del saldo entro la scadenza prevista per la specifica operazione costituiscono ritardo dell'Acquirente. A decorrere dal primo giorno successivo alla rispettiva scadenza trovano applicazione, per quanto compatibili, le disposizioni dell'art. 12.6, ivi compresa la penale di € 150,00 per ciascun giorno di ritardo</w:t>
+        <w:t>Il mancato pagamento del Pagamento anticipato entro il relativo termine ovvero il mancato pagamento integrale del saldo entro la scadenza prevista per la specifica operazione costituiscono ritardo dell'Acquirente. A decorrere dal primo giorno successivo alla rispettiva scadenza trovano applicazione, per quanto compatibili, le disposizioni dell'art. 12.6, ivi compresa la penale di € 150,00 (euro centocinquanta/00) per ciascun giorno di ritardo</w:t>
       </w:r>
       <w:r>
         <w:rPr>
@@ -17441,7 +17361,7 @@
           <w:sz w:val="20"/>
           <w:szCs w:val="20"/>
         </w:rPr>
-        <w:t xml:space="preserve">L'Annullamento della vendita costituisce l'istituto contrattuale mediante il quale Fleequid, nei casi previsti dalle presenti Condizioni Generali, dalle Condizioni Specifiche o dalle Condizioni particolari di vendita applicabili, dispone che l'operazione non sia eseguita o cessi di essere eseguita, in tutto o limitatamente a uno o più Veicoli. L'Annullamento della vendita non coincide necessariamente con l'annullamento del contratto per cause di invalidità né con la risoluzione per inadempimento: la causa giuridica concreta dipende dalla singola fattispecie che lo determina. Quando l'Annullamento consegue a un inadempimento assistito da clausola risolutiva espressa ai sensi delle presenti Condizioni Generali, esso opera quale risoluzione del Contratto ai sensi dell'art. 1456 c.c. e ne produce gli effetti. Negli altri casi l'Annullamento produce gli </w:t>
+        <w:t xml:space="preserve">L'Annullamento della vendita costituisce l'istituto contrattuale mediante il quale Fleequid, nei casi previsti dalle presenti Condizioni Generali, dalle Condizioni Specifiche applicabili o dalle Condizioni particolari di vendita applicabili, dispone che l'operazione non sia eseguita o cessi di essere eseguita, in tutto o limitatamente a uno o più Veicoli. L'Annullamento della vendita non coincide necessariamente con l'annullamento del contratto per cause di invalidità né con la risoluzione per inadempimento: la causa giuridica concreta dipende dalla singola fattispecie che lo determina. Quando l'Annullamento consegue a un inadempimento assistito da clausola risolutiva espressa ai sensi delle presenti Condizioni Generali, esso opera quale risoluzione del Contratto ai sensi dell'art. 1456 c.c. e ne produce gli effetti. Negli altri casi l'Annullamento produce gli </w:t>
       </w:r>
       <w:r>
         <w:rPr>
@@ -17961,18 +17881,18 @@
           <w:sz w:val="20"/>
           <w:szCs w:val="20"/>
         </w:rPr>
-        <w:t>Le somme che, nonostante l'Annullamento della vendita, la riduzione del suo oggetto o il sorgere di un obbligo restitutorio, restino definitivamente dovute ai sensi delle presenti Condizioni Generali non sono oggetto di restituzione. Rientrano tra tali somme, in particolare</w:t>
-      </w:r>
-      <w:r>
-        <w:t xml:space="preserve"> </w:t>
-      </w:r>
-      <w:r>
-        <w:rPr>
-          <w:rFonts w:ascii="Verdana" w:hAnsi="Verdana"/>
-          <w:sz w:val="20"/>
-          <w:szCs w:val="20"/>
-        </w:rPr>
-        <w:t>le Commissioni già maturate ai sensi dell'art. 12.4, fermo quanto previsto dall'art. 14.7 per le Commissioni a carico dell'Acquirente in caso di Annullamento a lui non imputabile</w:t>
+        <w:t>Le somme che, nonostante l'Annullamento della vendita, la riduzione del suo oggetto o il sorgere di un obbligo restitutorio, restino definitivamente dovute ai sensi delle presenti Condizioni Generali non sono oggetto di restituzione. Rientrano tra tali somme, in particolare, le Commissioni</w:t>
+      </w:r>
+      <w:r>
+        <w:t xml:space="preserve"/>
+      </w:r>
+      <w:r>
+        <w:rPr>
+          <w:rFonts w:ascii="Verdana" w:hAnsi="Verdana"/>
+          <w:sz w:val="20"/>
+          <w:szCs w:val="20"/>
+        </w:rPr>
+        <w:t xml:space="preserve"> già maturate ai sensi dell'art. 12.4, fermo quanto previsto dall'art. 14.7 per le Commissioni a carico dell'Acquirente in caso di Annullamento a lui non imputabile</w:t>
       </w:r>
       <w:r>
         <w:rPr>
@@ -18079,7 +17999,7 @@
           <w:szCs w:val="20"/>
         </w:rPr>
         <w:lastRenderedPageBreak/>
-        <w:t xml:space="preserve">prestare tempestivamente ogni collaborazione necessaria alle relative formalità; tale disciplina si applica, in particolare, nella Vendita in commissione, sia quando Fleequid abbia operato mediante Rivendita sia quando abbia operato quale Intermediario puro, nei limiti compatibili con la struttura della specifica operazione. Nel Dealer Sales, qualora l'Annullamento riguardi esclusivamente la vendita tra Fleequid e l'Acquirente, il Veicolo è restituito a Fleequid; qualora l'Annullamento o la risoluzione comportino altresì il venir meno, totale o parziale, degli effetti del rapporto di acquisto tra il Venditore e Fleequid, il Venditore è tenuto a riottenere la proprietà e il possesso del Veicolo e a compiere tutti gli adempimenti necessari a tal fine. Il Venditore o l'Acquirente, quando sia tenuto alla restituzione di somme, alla restituzione o riconsegna del Veicolo, al ritrasferimento o alla reintestazione della proprietà, al ritiro del Veicolo, alla restituzione dei relativi documenti o al compimento delle formalità necessarie, non può rifiutare o ritardare ingiustificatamente il proprio adempimento. Ferma la scadenza prevista dall'art. 15.2 per la restituzione delle somme, gli adempimenti relativi alla restituzione o riconsegna del Veicolo, al ritrasferimento o alla reintestazione, al ritiro e alla relativa documentazione devono essere eseguiti entro 5 (cinque) giorni dalla richiesta scritta di Fleequid, salvo che la natura dell'adempimento o disposizioni inderogabili di legge richiedano un diverso termine. Decorso inutilmente il termine applicabile per fatto imputabile, il Venditore o l'Acquirente inadempiente è tenuto a corrispondere a Fleequid, a titolo di penale, l'importo di € 150,00 (euro centocinquanta/00) </w:t>
+        <w:t xml:space="preserve">prestare tempestivamente ogni collaborazione necessaria alle relative formalità; tale disciplina si applica, in particolare, nella Vendita in commissione, sia quando Fleequid abbia operato mediante Rivendita sia quando abbia operato quale Intermediario puro, nei limiti compatibili con la struttura della specifica operazione. Nel Dealer Sales, qualora l'Annullamento riguardi esclusivamente la vendita tra Fleequid e l'Acquirente, il Veicolo è restituito a Fleequid; qualora l'Annullamento o la risoluzione comportino altresì il venir meno, totale o parziale, degli effetti del rapporto di acquisto tra il Venditore e Fleequid, il Venditore è tenuto a riottenere la proprietà e il possesso del Veicolo e a compiere tutti gli adempimenti necessari a tal fine. Il Venditore o l'Acquirente, quando sia tenuto alla restituzione di somme, alla restituzione o riconsegna del Veicolo, al ritrasferimento o alla reintestazione della proprietà, al ritiro del Veicolo, alla restituzione dei relativi documenti o al compimento delle formalità necessarie, non può rifiutare o ritardare ingiustificatamente il proprio adempimento. Ferma la scadenza prevista dall'art. 15.2 per la restituzione delle somme, gli adempimenti relativi alla restituzione o riconsegna del Veicolo, al ritrasferimento o alla reintestazione, al ritiro e alla relativa documentazione devono essere eseguiti entro 5 (cinque) giorni dalla richiesta scritta di Fleequid, salvo che la natura dell'adempimento o disposizioni inderogabili di legge richiedano un diverso termine. Decorso inutilmente il termine applicabile per fatto a lui imputabile, il Venditore o l'Acquirente inadempiente è tenuto a corrispondere a Fleequid, a titolo di penale, l'importo di € 150,00 (euro centocinquanta/00) </w:t>
       </w:r>
       <w:r>
         <w:rPr>
@@ -18681,7 +18601,7 @@
           <w:sz w:val="20"/>
           <w:szCs w:val="20"/>
         </w:rPr>
-        <w:t>) si obbliga a trasmettere a Fleequid idonea prova documentale dell'avvenuto compimento o deposito delle formalità entro 1 (un) giorno dalla disponibilità del relativo documento o riscontro dell'autorità competente. In caso di ritardo imputabile all'Acquirente oltre il termine di cui alla lett. b), questi è tenuto a corrispondere a Fleequid una penale pari a € 150,00 (euro centocinquanta/00) per ciascun giorno di ritardo e per ciascun Veicolo interessato, sino al completamento degli adempimenti, fatto salvo il risarcimento del maggior danno. Qualora il ritardo ecceda 30 (trenta) giorni, Fleequid può avvalersi degli ulteriori rimedi previsti dalle presenti Condizioni Generali e dalla legge, ivi compresa, ove giuridicamente e materialmente praticabile, la facoltà di promuovere presso le competenti autorità le iniziative necessarie per ottenere l'intestazione del Veicolo in capo al soggetto tenuto, con addebito a quest'ultimo delle relative spese, oneri e costi, ferme le penali già maturate. Nelle operazioni assistite da una Soluzione di finanziamento la sequenza degli adempimenti di intestazione, fatturazione, pagamento, trasferimento della proprietà e consegna può differire da quella ordinaria secondo quanto previsto dall'art. 22 e dalle Condizioni Specifiche applicabili</w:t>
+        <w:t>) si obbliga a trasmettere a Fleequid idonea prova documentale dell'avvenuto compimento o deposito delle formalità entro 1 (un) giorno dalla disponibilità del relativo documento o riscontro dell'autorità competente. In caso di ritardo imputabile all'Acquirente oltre il termine di cui al punto (ii), questi è tenuto a corrispondere a Fleequid una penale pari a € 150,00 (euro centocinquanta/00) per ciascun giorno di ritardo e per ciascun Veicolo interessato, sino al completamento degli adempimenti, fatto salvo il risarcimento del maggior danno. Qualora il ritardo ecceda 30 (trenta) giorni, Fleequid può avvalersi degli ulteriori rimedi previsti dalle presenti Condizioni Generali e dalla legge, ivi compresa, ove giuridicamente e materialmente praticabile, la facoltà di promuovere presso le competenti autorità le iniziative necessarie per ottenere l'intestazione del Veicolo in capo al soggetto tenuto, con addebito a quest'ultimo delle relative spese, oneri e costi, ferme le penali già maturate. Nelle operazioni assistite da una Soluzione di finanziamento la sequenza degli adempimenti di intestazione, fatturazione, pagamento, trasferimento della proprietà e consegna può differire da quella ordinaria secondo quanto previsto dall'art. 22 e dalle Condizioni Specifiche applicabili</w:t>
       </w:r>
       <w:r>
         <w:rPr>
@@ -19714,7 +19634,7 @@
           <w:sz w:val="20"/>
           <w:szCs w:val="20"/>
         </w:rPr>
-        <w:t>Le disposizioni del presente articolo si applicano alle operazioni strutturate secondo il Modello di Vendita in commissione. Nell'ambito di tale Modello, Fleequid dà esecuzione all'operazione mediante Rivendita ai sensi dell'art. 2.5 ovvero può decidere di operare quale Intermediario puro ai sensi dell'art. 2.6, con trasferimento del Veicolo direttamente dal Venditore all'Acquirente. La possibilità che l'operazione sia eseguita secondo l'una o l'altra modalità è resa conoscibile e accettata prima della formulazione dell'Offerta ai sensi dell'art. 3.2, lett. a). Fleequid può esercitare la relativa scelta anche successivamente al perfezionamento dell'Accordo vincolante e comunque non oltre la messa a disposizione della Proforma, che cristallizza la modalità di esecuzione prescelta ai sensi dell'art. 11.4; la Proforma non costituisce fonte negoziale della scelta, ma documenta l'esercizio di una facoltà preventivamente resa conoscibile e accettata. La scelta tra Rivendita e operatività quale Intermediario puro non modifica il Modello di Vendita, non determina il venir meno dell'incarico conferito a Fleequid dal Venditore e dall'Acquirente e non incide sul diritto di Fleequid alle Commissioni dovute da entrambi. La qualificazione di Fleequid quale commissionaria operante in nome proprio ai sensi dell'art. 1731 c.c. ricorre esclusivamente nella Rivendita ai sensi dell'art. 2.5; quando Fleequid opera quale Intermediario puro la compravendita è conclusa direttamente tra il Venditore e l'Acquirente ai sensi degli artt. 2.6 e 17.10. Salvo espresso richiamo o quanto compatibile con la natura della specifica disposizione, le norme del presente articolo non si applicano al Dealer Sales, disciplinato dall'art. 18.</w:t>
+        <w:t>Le disposizioni del presente articolo si applicano alle operazioni strutturate secondo il Modello di Vendita in commissione. Nell'ambito di tale Modello, Fleequid dà esecuzione all'operazione mediante Rivendita ai sensi dell'art. 2.5 ovvero può decidere di operare quale Intermediario puro ai sensi dell'art. 2.6, con trasferimento del Veicolo direttamente dal Venditore all'Acquirente. La possibilità che l'operazione sia eseguita secondo l'una o l'altra modalità è resa conoscibile prima della formulazione dell'Offerta ai sensi dell'art. 3.2, lett. a), ed è accettata mediante l’adesione alle presenti CG. Fleequid può esercitare la relativa scelta anche successivamente al perfezionamento dell'Accordo vincolante e comunque non oltre la messa a disposizione della Proforma, che cristallizza la modalità di esecuzione prescelta ai sensi dell'art. 11.4; la Proforma non costituisce fonte negoziale della scelta, ma documenta l'esercizio di una facoltà preventivamente resa conoscibile e accettata. La scelta tra Rivendita e operatività quale Intermediario puro non modifica il Modello di Vendita, non determina il venir meno dell'incarico conferito a Fleequid dal Venditore e dall'Acquirente e non incide sul diritto di Fleequid alle Commissioni dovute da entrambi. La qualificazione di Fleequid quale commissionaria operante in nome proprio ai sensi dell'art. 1731 c.c. ricorre esclusivamente nella Rivendita ai sensi dell'art. 2.5; quando Fleequid opera quale Intermediario puro la compravendita è conclusa direttamente tra il Venditore e l'Acquirente ai sensi degli artt. 2.6 e 17.10. Salvo espresso richiamo o quanto compatibile con la natura della specifica disposizione, le norme del presente articolo non si applicano al Dealer Sales, disciplinato dall'art. 18.</w:t>
       </w:r>
       <w:r>
         <w:t xml:space="preserve"> </w:t>
@@ -20035,7 +19955,7 @@
           <w:sz w:val="20"/>
           <w:szCs w:val="20"/>
         </w:rPr>
-        <w:t>del Prezzo di riserva, in quanto determinato sulla base del PMIV fissato dal Venditore, assicura a quest'ultimo un incasso netto almeno pari al PMIV, salva la diversa espressa accettazione di offerte inferiori ai sensi dell'art. 10.3. Qualora la vendita sia annullata o il suo oggetto ridotto ai sensi dell'art. 14, il Prezzo di acquisto netto dovuto al Venditore è rideterminato secondo i criteri previsti dall'art. 14.5. Resta salva la deroga espressa prevista dall'art. 22.9 per le operazioni assistite da una Soluzione di finanziamento. Le disposizioni del presente comma non si applicano quando Fleequid opera quale Intermediario puro</w:t>
+        <w:t>del Prezzo di riserva, in quanto determinato sulla base del PMIV fissato dal Venditore, assicura a quest'ultimo un incasso netto almeno pari al PMIV, salva la diversa espressa accettazione di Offerte inferiori ai sensi dell'art. 10.3. Qualora la vendita sia annullata o il suo oggetto ridotto ai sensi dell'art. 14, il Prezzo di acquisto netto dovuto al Venditore è rideterminato secondo i criteri previsti dall'art. 14.5. Resta salva la deroga espressa prevista dall'art. 22.9 per le operazioni assistite da una Soluzione di finanziamento. Le disposizioni del presente comma non si applicano quando Fleequid opera quale Intermediario puro</w:t>
       </w:r>
       <w:r>
         <w:rPr>
@@ -20108,7 +20028,7 @@
           <w:sz w:val="20"/>
           <w:szCs w:val="20"/>
         </w:rPr>
-        <w:t>. In caso di ritardo imputabile al Venditore nell'emissione o nella trasmissione della fattura oltre il predetto termine, il Venditore è tenuto a corrispondere a Fleequid una penale pari a € 150,00 (euro centocinquanta/00) per ciascun giorno di ritardo e per ciascun Veicolo interessato, sino all'adempimento, che Fleequid ha diritto di compensare sull'importo della fattura, fatto salvo il risarcimento del maggior danno. Qualora, per effetto del mancato pagamento dell'Acquirente, dell'Annullamento della vendita, della riduzione del suo oggetto, della rettifica dell'operazione o per altra causa prevista dalle presenti Condizioni Generali, si renda necessaria l'emissione di una nota di credito, di un documento di storno o rettifica ovvero la riemissione della fattura, anche in conseguenza di una nuova vendita del Veicolo a un diverso Offerente per un importo differente, il Venditore è tenuto a provvedervi entro 5 (cinque) giorni dalla richiesta di Fleequid; in caso di ritardo imputabile al Venditore trova applicazione la medesima penale giornaliera, che Fleequid ha diritto di compensare o detrarre da successive spettanze. Restano ferme le disposizioni degli artt. 15 e 16.2 relative alle restituzioni, alla documentazione fiscale e agli ulteriori adempimenti necessari all'esecuzione o al ripristino dell'operazione</w:t>
+        <w:t>. In caso di ritardo nell'emissione o nella trasmissione della fattura oltre il predetto termine, il Venditore è tenuto a corrispondere a Fleequid una penale pari a € 150,00 (euro centocinquanta/00) per ciascun giorno di ritardo e per ciascun Veicolo interessato, sino all'adempimento, che Fleequid ha diritto di compensare sull'importo della fattura, fatto salvo il risarcimento del maggior danno. Qualora, per effetto del mancato pagamento dell'Acquirente, dell'Annullamento della vendita, della riduzione del suo oggetto, della rettifica dell'operazione o per altra causa prevista dalle presenti Condizioni Generali, si renda necessaria l'emissione di una nota di credito, di un documento di storno o rettifica ovvero la riemissione della fattura, anche in conseguenza di una nuova vendita del Veicolo a un diverso Offerente per un importo differente, il Venditore è tenuto a provvedervi entro 5 (cinque) giorni dalla richiesta di Fleequid; in caso di ritardo imputabile al Venditore trova applicazione la medesima penale giornaliera, che Fleequid ha diritto di compensare o detrarre da successive spettanze. Restano ferme le disposizioni degli artt. 15 e 16.2 relative alle restituzioni, alla documentazione fiscale e agli ulteriori adempimenti necessari all'esecuzione o al ripristino dell'operazione</w:t>
       </w:r>
       <w:r>
         <w:rPr>
@@ -20448,7 +20368,7 @@
           <w:szCs w:val="20"/>
         </w:rPr>
         <w:lastRenderedPageBreak/>
-        <w:t>riferimento al rifiuto o all'omissione di trasferire la proprietà del Veicolo di cui alla lett. f), la penale prevista dal presente comma non trova applicazione per il medesimo fatto neppure prima che siano integrati i presupposti del rifiuto previsti dall'art. 8.11; integrati tali presupposti, trova applicazione la penale specifica prevista dall'art. 8.11, restando ferme la facoltà di risoluzione ai sensi dell'art. 1456 c.c. e le ulteriori conseguenze previste dal presente comma diverse dalla penale.</w:t>
+        <w:t>riferimento al rifiuto o all'omissione di trasferire la proprietà del Veicolo di cui alla lett. f), la penale prevista dal presente comma non trova applicazione per il medesimo fatto neppure prima che siano integrati i presupposti del rifiuto previsti dall'art. 8.11; integrati tali presupposti, trova applicazione la penale specifica prevista dall'art. 8.11, lett. a), restando ferme la facoltà di risoluzione ai sensi dell'art. 1456 c.c. e le ulteriori conseguenze previste dal presente comma diverse dalla penale.</w:t>
       </w:r>
     </w:p>
     <w:p>
@@ -20585,7 +20505,7 @@
           <w:sz w:val="20"/>
           <w:szCs w:val="20"/>
         </w:rPr>
-        <w:t xml:space="preserve">Quando Fleequid opera quale Intermediario puro, il Venditore è tenuto a emettere e trasmettere all'Acquirente la fattura di vendita del Veicolo entro 5 (cinque) giorni dalla ricezione dei dati necessari alla sua emissione ai sensi dell'art. 11.4; la fattura deve corrispondere al prezzo dovuto direttamente al Venditore, oltre all'IVA ove applicabile. In caso di ritardo nell'emissione o nella trasmissione della fattura il Venditore è tenuto a corrispondere a Fleequid una penale pari a € 150,00 (euro centocinquanta/00) per ciascun giorno di ritardo e per ciascun Veicolo interessato, </w:t>
+        <w:t xml:space="preserve">Quando Fleequid opera quale Intermediario puro, il Venditore è tenuto a emettere e trasmettere all'Acquirente la fattura di vendita del Veicolo entro 5 (cinque) giorni dalla ricezione dei dati necessari alla sua emissione ai sensi dell'art. 11.4; la fattura deve corrispondere al prezzo dovuto direttamente al Venditore, oltre all'IVA ove applicabile. In caso di ritardo nell'emissione o nella trasmissione della fattura, il Venditore è tenuto a corrispondere a Fleequid una penale pari a € 150,00 (euro centocinquanta/00) per ciascun giorno di ritardo e per ciascun Veicolo interessato, </w:t>
       </w:r>
       <w:r>
         <w:rPr>
@@ -20930,7 +20850,7 @@
           <w:sz w:val="20"/>
           <w:szCs w:val="20"/>
         </w:rPr>
-        <w:t>Nel Dealer Sales il Venditore è tenuto, su richiesta di Fleequid, a emettere nei confronti di quest'ultima la fattura relativa alla vendita del Veicolo entro 5 (cinque) giorni dalla richiesta, secondo i dati e le indicazioni comunicati da Fleequid. La fattura è emessa con riferimento al Prezzo di acquisto concordato ai sensi dell'art. 18.3, oltre all'IVA ove applicabile e agli eventuali ulteriori importi riferibili esclusivamente al relativo rapporto di compravendita. In caso di ritardo imputabile al Venditore nell'emissione o nella trasmissione della fattura, il Venditore è tenuto a corrispondere a Fleequid una penale pari a € 150,00 (euro centocinquanta/00) per ciascun giorno di ritardo e per ciascun Veicolo interessato, sino all'adempimento, fatto salvo il risarcimento del maggior danno. Qualora si renda necessaria l'emissione di una nota di credito, di un documento di storno o rettifica ovvero la riemissione della fattura, il Venditore è tenuto a provvedervi entro 5 (cinque) giorni dalla richiesta di Fleequid, con applicazione della medesima penale in caso di ritardo. Resta distinta e autonoma la fatturazione emessa da Fleequid nei confronti dell'Acquirente, disciplinata dall'art. 16.2.</w:t>
+        <w:t>Nel Dealer Sales il Venditore è tenuto, su richiesta di Fleequid, a emettere nei confronti di quest'ultima la fattura relativa alla vendita del Veicolo entro 5 (cinque) giorni dalla richiesta, secondo i dati e le indicazioni comunicati da Fleequid. La fattura è emessa con riferimento al Prezzo di acquisto concordato ai sensi dell'art. 18.3, oltre all'IVA ove applicabile e agli eventuali ulteriori importi riferibili esclusivamente al relativo rapporto di compravendita. In caso di ritardo nell'emissione o nella trasmissione della fattura, il Venditore è tenuto a corrispondere a Fleequid una penale pari a € 150,00 (euro centocinquanta/00) per ciascun giorno di ritardo e per ciascun Veicolo interessato, sino all'adempimento, fatto salvo il risarcimento del maggior danno. Qualora si renda necessaria l'emissione di una nota di credito, di un documento di storno o rettifica ovvero la riemissione della fattura, il Venditore è tenuto a provvedervi entro 5 (cinque) giorni dalla richiesta di Fleequid, con applicazione della medesima penale in caso di ritardo. Resta distinta e autonoma la fatturazione emessa da Fleequid nei confronti dell'Acquirente, disciplinata dall'art. 16.2.</w:t>
       </w:r>
     </w:p>
     <w:p>
@@ -20982,7 +20902,7 @@
           <w:sz w:val="20"/>
           <w:szCs w:val="20"/>
         </w:rPr>
-        <w:t>. L'acquisto del Veicolo da parte di Fleequid non estingue né riduce tali tutele. La manleva di cui all'art. 8.13 opera espressamente anche con riferimento alle pretese avanzate dall'Acquirente nei confronti di Fleequid quale venditore sostanziale, nonché alle somme, ai costi, alle riparazioni, alle spese, agli oneri e ai danni che Fleequid sostenga in tale veste per fatti, vizi, difetti, omissioni o inadempimenti imputabili al Venditore, con diritto di regresso e di rimborso integrale nei confronti di quest'ultimo. Qualora una difformità, un vizio, un danno o altra circostanza imputabile al Venditore emerga o sia denunciata dall'Acquirente successivamente alla rivendita del Veicolo, Fleequid conserva il diritto di farla valere nei confronti del Venditore nei termini previsti dall'art. 17.7, decorrenti, ove il fatto non fosse già precedentemente noto a Fleequid, dalla relativa scoperta o dalla ricezione del reclamo dell'Acquirente. Il pagamento del Prezzo di acquisto, la presa in consegna del Veicolo da parte di Fleequid o di soggetti da essa incaricati e la successiva rivendita all'Acquirente non comportano rinuncia ai diritti di manleva, regresso, rimborso o agli ulteriori rimedi spettanti a Fleequid nei confronti del Venditore.</w:t>
+        <w:t>. L'acquisto del Veicolo da parte di Fleequid non estingue né riduce tali tutele. La manleva di cui all'art. 8.13 opera espressamente anche con riferimento alle pretese avanzate dall'Acquirente nei confronti di Fleequid quale venditore sostanziale, nonché alle somme, ai costi, alle riparazioni, alle spese, agli oneri e ai danni che Fleequid sostenga in tale veste per fatti, vizi, difetti, omissioni o inadempimenti imputabili al Venditore, con diritto di regresso e di rimborso integrale nei confronti di quest'ultimo. Qualora una difformità, un vizio, un danneggiamento del Veicolo o altra circostanza imputabile al Venditore emerga, o sia denunciata dall'Acquirente, successivamente alla rivendita del Veicolo, Fleequid conserva il diritto di farla valere nei confronti del Venditore nei termini previsti dall'art. 17.7, decorrenti, ove il fatto non fosse già precedentemente noto a Fleequid, dalla relativa scoperta o dalla ricezione del reclamo dell'Acquirente. Il pagamento del Prezzo di acquisto, la presa in consegna del Veicolo da parte di Fleequid o di soggetti da essa incaricati e la successiva rivendita all'Acquirente non comportano rinuncia ai diritti di manleva, regresso, rimborso o agli ulteriori rimedi spettanti a Fleequid nei confronti del Venditore.</w:t>
       </w:r>
     </w:p>
     <w:p>
@@ -21467,7 +21387,7 @@
           <w:sz w:val="20"/>
           <w:szCs w:val="20"/>
         </w:rPr>
-        <w:t xml:space="preserve">Prima della formulazione dell'Offerta l'Acquirente è tenuto a esaminare, con la diligenza richiesta dalla propria qualità professionale, l'Inserzione, le Specifiche tecniche, il TrustReport ove disponibile, le fotografie, la documentazione e ogni altra informazione resa disponibile in relazione al Veicolo, nonché ad avvalersi, ove resa disponibile da Fleequid o dal Venditore, della possibilità di visionare, ispezionare e provare il Veicolo. Non possono essere qualificati come vizi occulti né possono fondare richieste di garanzia, riduzione del prezzo, indennizzo o risarcimento i vizi, i difetti, le difformità, le condizioni d'uso, l'usura, le carenze di conformità o le mancanze — anche relative a parti non immediatamente visibili o non facilmente raggiungibili — che risultassero dalle informazioni o dalla documentazione rese disponibili ovvero che l'Acquirente avrebbe potuto rilevare mediante l'esame delle stesse o avvalendosi dell'eventuale possibilità di ispezione e prova del Veicolo. La mancata effettuazione dell'ispezione o della prova, </w:t>
+        <w:t xml:space="preserve">Prima della formulazione dell'Offerta l'Acquirente è tenuto a esaminare, con la diligenza richiesta dalla propria qualità professionale, l'Inserzione, le Specifiche tecniche, il TrustReport ove disponibile, le fotografie, la documentazione e ogni altra informazione resa disponibile in relazione al Veicolo, nonché ad avvalersi della possibilità di visionare, ispezionare e provare il Veicolo. Non possono essere qualificati come vizi occulti né possono fondare richieste di garanzia, riduzione del prezzo, indennizzo o risarcimento i vizi, i difetti, le difformità, le condizioni d'uso, l'usura, le carenze di conformità o le mancanze — anche relative a parti non immediatamente visibili o non facilmente raggiungibili — che risultassero dalle informazioni o dalla documentazione rese disponibili ovvero che l'Acquirente avrebbe potuto rilevare mediante l'esame delle stesse o avvalendosi della possibilità di ispezione e prova del Veicolo. La mancata effettuazione dell'ispezione o della prova, </w:t>
       </w:r>
       <w:r>
         <w:rPr>
@@ -21995,42 +21915,19 @@
       <w:r>
         <w:rPr>
           <w:rFonts w:ascii="Verdana" w:hAnsi="Verdana"/>
-          <w:sz w:val="20"/>
-          <w:szCs w:val="20"/>
-        </w:rPr>
-        <w:t xml:space="preserve">Vendita in commissione con operatività di Fleequid </w:t>
-      </w:r>
-      <w:r>
-        <w:rPr>
-          <w:rFonts w:ascii="Verdana" w:hAnsi="Verdana"/>
-          <w:sz w:val="20"/>
-          <w:szCs w:val="20"/>
-        </w:rPr>
-        <w:t>quale</w:t>
-      </w:r>
-      <w:r>
-        <w:rPr>
-          <w:rFonts w:ascii="Verdana" w:hAnsi="Verdana"/>
-          <w:sz w:val="20"/>
-          <w:szCs w:val="20"/>
-        </w:rPr>
-        <w:t xml:space="preserve"> Intermediario puro. </w:t>
-      </w:r>
-      <w:r>
-        <w:rPr>
-          <w:rFonts w:ascii="Verdana" w:hAnsi="Verdana"/>
-          <w:sz w:val="20"/>
-          <w:szCs w:val="20"/>
-        </w:rPr>
-        <w:t>Quando Fleequid opera ai sensi dell'art. 2.6, la compravendita e il relativo rapporto di garanzia intercorrono direttamente ed esclusivamente tra il Venditore e l'Acquirente, nei limiti, con le esclusioni e secondo i termini convenzionali previsti dal presente articolo, che il Venditore e l'Acquirente convengono espressamente di applicare anche al loro rapporto diretto. Fleequid non acquista il Veicolo, non assume la qualità di venditore e non risponde della sua conformità, delle sue qualità, dei suoi vizi o difetti né dell'adempimento delle obbligazioni di garanzia del Venditore. Il Venditore e l'Acquirente, ciascuno per quanto di propria competenza, si impegnano a manlevare e tenere indenne Fleequid da qualsiasi domanda, azione, eccezione, richiesta di garanzia, restituzione, riduzione del prezzo, indennizzo o risarcimento, nonché dai relativi costi e spese, concernente il Veicolo o la relativa compravendita. La clausola di collegamento di cui all'art. 21 non trova applicazione, non essendo Fleequid parte della compravendita</w:t>
-      </w:r>
-      <w:r>
-        <w:rPr>
-          <w:rFonts w:ascii="Verdana" w:hAnsi="Verdana"/>
-          <w:sz w:val="20"/>
-          <w:szCs w:val="20"/>
-        </w:rPr>
-        <w:t>.</w:t>
+          <w:b/>
+          <w:sz w:val="20"/>
+          <w:szCs w:val="20"/>
+        </w:rPr>
+        <w:t>Vendita in commissione con operatività di Fleequid quale Intermediario puro</w:t>
+      </w:r>
+      <w:r>
+        <w:rPr>
+          <w:rFonts w:ascii="Verdana" w:hAnsi="Verdana"/>
+          <w:sz w:val="20"/>
+          <w:szCs w:val="20"/>
+        </w:rPr>
+        <w:t>. Quando Fleequid opera ai sensi dell'art. 2.6, la compravendita e il relativo rapporto di garanzia intercorrono direttamente ed esclusivamente tra il Venditore e l'Acquirente, nei limiti, con le esclusioni e secondo i termini convenzionali previsti dal presente articolo, che il Venditore e l'Acquirente convengono espressamente di applicare anche al loro rapporto diretto. Fleequid non acquista il Veicolo, non assume la qualità di venditore e non risponde della sua conformità, delle sue qualità, dei suoi vizi o difetti né dell'adempimento delle obbligazioni di garanzia del Venditore. Il Venditore e l'Acquirente, ciascuno per quanto di propria competenza, si impegnano a manlevare e tenere indenne Fleequid da qualsiasi domanda, azione, eccezione, richiesta di garanzia, restituzione, riduzione del prezzo, indennizzo o risarcimento, nonché dai relativi costi e spese, concernente il Veicolo o la relativa compravendita. La clausola di collegamento di cui all'art. 21 non trova applicazione, non essendo Fleequid parte della compravendita.</w:t>
       </w:r>
     </w:p>
     <w:p>
@@ -22072,7 +21969,7 @@
           <w:sz w:val="20"/>
           <w:szCs w:val="20"/>
         </w:rPr>
-        <w:t xml:space="preserve"> Nelle vendite concluse secondo il Dealer Sales Fleequid assume la qualità di venditore sostanziale nei confronti dell'Acquirente, ma la garanzia è esclusivamente quella risultante dal patto tra Professionisti contenuto nel presente articolo, con tutte le esclusioni, limitazioni, presupposti e decadenze ivi previsti. Nessuna garanzia ulteriore, espressa o implicita, può considerarsi prestata da Fleequid salvo che sia specificamente assunta per iscritto nella singola operazione. La denuncia di vizi, difetti o difformità deve essere effettuata, a pena di decadenza, nei termini e con le modalità previsti dall'art. 20.2 e comunque entro 30 (trenta) giorni dalla consegna e a condizione che il Veicolo non abbia successivamente percorso più di 1.000 (mille) km, termini che le Parti convengono espressamente quali termini convenzionali di decadenza ai sensi dell'art. 1495 c.c. Resta inoltre fermo quanto previsto dall'art. 16.12 per i vizi, i danni e le difformità apparenti rilevabili al momento della consegna. L'eventuale responsabilità di Fleequid non può in alcun caso estendersi oltre il regime di garanzia espressamente convenuto, ferme le garanzie, le manleve, gli obblighi di rimborso e i diritti di regresso spettanti a Fleequid nei confronti del Venditore originario ai sensi degli artt. 8.13, 18.5 e 19.6. Al Dealer Sales non si applica la clausola di collegamento di cui all'art. 21 e la relativa disciplina non è suscettibile di applicazione analogica</w:t>
+        <w:t xml:space="preserve"> Nelle vendite concluse secondo il Dealer Sales Fleequid assume la qualità di venditore sostanziale nei confronti dell'Acquirente, ma la garanzia è esclusivamente quella risultante dal patto tra Professionisti contenuto nel presente articolo, con tutte le esclusioni, limitazioni, presupposti e decadenze ivi previsti. Nessuna garanzia ulteriore, espressa o implicita, può considerarsi prestata da Fleequid salvo che sia specificamente assunta per iscritto nella singola operazione. La denuncia di vizi, difetti o difformità deve essere effettuata, a pena di decadenza, nei termini e con le modalità previsti dall'art. 20.2 e comunque entro 30 (trenta) giorni di calendario dalla consegna e a condizione che il Veicolo non abbia successivamente percorso più di 1.000 (mille) km, termini che le Parti convengono espressamente quali termini convenzionali di decadenza ai sensi dell'art. 1495 c.c. Resta inoltre fermo quanto previsto dall'art. 16.12 per i vizi, i danni e le difformità apparenti rilevabili al momento della consegna. L'eventuale responsabilità di Fleequid non può in alcun caso estendersi oltre il regime di garanzia espressamente convenuto, ferme le garanzie, le manleve, gli obblighi di rimborso e i diritti di regresso spettanti a Fleequid nei confronti del Venditore originario ai sensi degli artt. 8.13, 18.5 e 19.6. Al Dealer Sales non si applica la clausola di collegamento di cui all'art. 21 e la relativa disciplina non è suscettibile di applicazione analogica</w:t>
       </w:r>
       <w:r>
         <w:rPr>
@@ -22356,7 +22253,7 @@
           <w:sz w:val="20"/>
           <w:szCs w:val="20"/>
         </w:rPr>
-        <w:t>Le difformità, i vizi e i difetti rilevabili al momento della consegna devono essere previamente segnalati secondo quanto previsto dall'art. 16.12. A pena di decadenza, il reclamo deve pervenire a Fleequid al più tardi entro 30 (trenta) giorni dalla data di consegna e prima che il Veicolo abbia percorso ulteriori 1.000 (mille) km. Il reclamo deve contenere le informazioni e la documentazione, anche fotografica, necessarie alla valutazione della contestazione; Fleequid può richiedere ulteriori documenti o chiarimenti, che l'Acquirente è tenuto a fornire entro 5 (cinque) giorni dalla richiesta. In caso di mancato rispetto dei predetti termini o delle modalità richieste, Fleequid può non dare corso al reclamo e procedere alla sua archiviazione, e non è tenuta a prendere in considerazione reclami presentati con tempi, modalità o informazioni diversi da quelli previsti. I termini previsti dal presente comma operano quali termini convenzionali di decadenza in tutti i Modelli di Vendita, con la riserva di cui all'art. 19.8 e fermi restando, nei rapporti tra Fleequid e il Venditore, i diversi termini di denuncia previsti dagli artt. 17.7 e 18.5</w:t>
+        <w:t>Le difformità, i vizi e i difetti rilevabili al momento della consegna devono essere previamente segnalati secondo quanto previsto dall'art. 16.12. A pena di decadenza, il reclamo deve pervenire a Fleequid al più tardi entro 30 (trenta) giorni di calendario dalla data di consegna e prima che il Veicolo abbia percorso ulteriori 1.000 (mille) km. Il reclamo deve contenere le informazioni e la documentazione, anche fotografica, necessarie alla valutazione della contestazione; Fleequid può richiedere ulteriori documenti o chiarimenti, che l'Acquirente è tenuto a fornire entro 5 (cinque) giorni dalla richiesta. In caso di mancato rispetto dei predetti termini o delle modalità richieste, Fleequid può non dare corso al reclamo e procedere alla sua archiviazione, e non è tenuta a prendere in considerazione reclami presentati con tempi, modalità o informazioni diversi da quelli previsti. I termini previsti dal presente comma operano quali termini convenzionali di decadenza in tutti i Modelli di Vendita, con la riserva di cui all'art. 19.8 e fermi restando, nei rapporti tra Fleequid e il Venditore, i diversi termini di denuncia previsti dagli artt. 17.7 e 18.5</w:t>
       </w:r>
       <w:r>
         <w:rPr>
@@ -23391,7 +23288,7 @@
           <w:sz w:val="20"/>
           <w:szCs w:val="20"/>
         </w:rPr>
-        <w:t>Ai fini dell'art. 12.2 le Condizioni Specifiche possono attribuire a un impegno irrevocabile del Finanziatore, avente i requisiti ivi previsti, effetto equivalente all'integrale adempimento dell'obbligo di pagamento, individuando il momento dal quale tale effetto si produce. In assenza di tale espressa previsione rilevano esclusivamente i pagamenti effettivamente ricevuti dai rispettivi destinatari</w:t>
+        <w:t>Ai fini dell'art. 12.2 le Condizioni Specifiche possono attribuire a un impegno irrevocabile del Finanziatore, avente i requisiti previsti dalle medesime Condizioni Specifiche, effetto equivalente all'integrale adempimento dell'obbligo di pagamento, individuando il momento dal quale tale effetto si produce. In assenza di tale espressa previsione rilevano esclusivamente i pagamenti effettivamente ricevuti dai rispettivi destinatari</w:t>
       </w:r>
       <w:r>
         <w:rPr>
@@ -23990,7 +23887,7 @@
           <w:sz w:val="20"/>
           <w:szCs w:val="20"/>
         </w:rPr>
-        <w:t>22077 Olgiate Comasco (CO),</w:t>
+        <w:t>22077 Olgiate Comasco (CO)</w:t>
       </w:r>
     </w:p>
     <w:p>
@@ -25056,7 +24953,7 @@
           <w:sz w:val="20"/>
           <w:szCs w:val="20"/>
         </w:rPr>
-        <w:t>Art. 13 (Vendita differita: pagamento anticipato e Veicolo temporaneamente in uso presso il Venditore)</w:t>
+        <w:t>Art. 13 (Vendita differita: Pagamento anticipato e Veicolo temporaneamente in uso presso il Venditore)</w:t>
       </w:r>
       <w:r>
         <w:rPr>

</xml_diff>